<commit_message>
grammar and sentence fixes
</commit_message>
<xml_diff>
--- a/Labs/lab14 curveTracer Calibrate/curveTracer Calibrate Document.docx
+++ b/Labs/lab14 curveTracer Calibrate/curveTracer Calibrate Document.docx
@@ -997,14 +997,27 @@
       <w:r>
         <w:t xml:space="preserve">Figure </w:t>
       </w:r>
-      <w:fldSimple w:instr=" SEQ Figure \* ARABIC ">
-        <w:r>
-          <w:rPr>
-            <w:noProof/>
-          </w:rPr>
-          <w:t>1</w:t>
-        </w:r>
-      </w:fldSimple>
+      <w:r>
+        <w:fldChar w:fldCharType="begin"/>
+      </w:r>
+      <w:r>
+        <w:instrText xml:space="preserve"> SEQ Figure \* ARABIC </w:instrText>
+      </w:r>
+      <w:r>
+        <w:fldChar w:fldCharType="separate"/>
+      </w:r>
+      <w:r>
+        <w:rPr>
+          <w:noProof/>
+        </w:rPr>
+        <w:t>1</w:t>
+      </w:r>
+      <w:r>
+        <w:rPr>
+          <w:noProof/>
+        </w:rPr>
+        <w:fldChar w:fldCharType="end"/>
+      </w:r>
       <w:bookmarkEnd w:id="3"/>
       <w:r>
         <w:t xml:space="preserve">: </w:t>
@@ -1021,6 +1034,7 @@
       <w:r>
         <w:t xml:space="preserve">The signals needed to generate the characteristic family of curves for a BJT under test include </w:t>
       </w:r>
+      <w:proofErr w:type="spellStart"/>
       <w:r>
         <w:t>I</w:t>
       </w:r>
@@ -1030,9 +1044,11 @@
         </w:rPr>
         <w:t>b</w:t>
       </w:r>
+      <w:proofErr w:type="spellEnd"/>
       <w:r>
         <w:t xml:space="preserve">, the base current, </w:t>
       </w:r>
+      <w:proofErr w:type="spellStart"/>
       <w:r>
         <w:t>I</w:t>
       </w:r>
@@ -1042,6 +1058,7 @@
         </w:rPr>
         <w:t>c</w:t>
       </w:r>
+      <w:proofErr w:type="spellEnd"/>
       <w:r>
         <w:t xml:space="preserve"> the collector current</w:t>
       </w:r>
@@ -1051,6 +1068,7 @@
       <w:r>
         <w:t xml:space="preserve"> and </w:t>
       </w:r>
+      <w:proofErr w:type="spellStart"/>
       <w:r>
         <w:t>V</w:t>
       </w:r>
@@ -1066,6 +1084,7 @@
         </w:rPr>
         <w:t>e</w:t>
       </w:r>
+      <w:proofErr w:type="spellEnd"/>
       <w:r>
         <w:t xml:space="preserve"> the collector emitter voltage.  (Right) </w:t>
       </w:r>
@@ -1078,6 +1097,7 @@
         </w:rPr>
         <w:t xml:space="preserve"> </w:t>
       </w:r>
+      <w:proofErr w:type="spellStart"/>
       <w:r>
         <w:rPr>
           <w:iCs w:val="0"/>
@@ -1089,21 +1109,37 @@
           <w:iCs w:val="0"/>
           <w:vertAlign w:val="subscript"/>
         </w:rPr>
-        <w:t xml:space="preserve">c </w:t>
-      </w:r>
-      <w:r>
-        <w:rPr>
-          <w:iCs w:val="0"/>
-        </w:rPr>
-        <w:t>vs. V</w:t>
-      </w:r>
+        <w:t>c</w:t>
+      </w:r>
+      <w:proofErr w:type="spellEnd"/>
       <w:r>
         <w:rPr>
           <w:iCs w:val="0"/>
           <w:vertAlign w:val="subscript"/>
         </w:rPr>
+        <w:t xml:space="preserve"> </w:t>
+      </w:r>
+      <w:r>
+        <w:rPr>
+          <w:iCs w:val="0"/>
+        </w:rPr>
+        <w:t xml:space="preserve">vs. </w:t>
+      </w:r>
+      <w:proofErr w:type="spellStart"/>
+      <w:r>
+        <w:rPr>
+          <w:iCs w:val="0"/>
+        </w:rPr>
+        <w:t>V</w:t>
+      </w:r>
+      <w:r>
+        <w:rPr>
+          <w:iCs w:val="0"/>
+          <w:vertAlign w:val="subscript"/>
+        </w:rPr>
         <w:t>ce</w:t>
       </w:r>
+      <w:proofErr w:type="spellEnd"/>
       <w:r>
         <w:rPr>
           <w:iCs w:val="0"/>
@@ -1409,14 +1445,27 @@
       <w:r>
         <w:t xml:space="preserve">Figure </w:t>
       </w:r>
-      <w:fldSimple w:instr=" SEQ Figure \* ARABIC ">
-        <w:r>
-          <w:rPr>
-            <w:noProof/>
-          </w:rPr>
-          <w:t>2</w:t>
-        </w:r>
-      </w:fldSimple>
+      <w:r>
+        <w:fldChar w:fldCharType="begin"/>
+      </w:r>
+      <w:r>
+        <w:instrText xml:space="preserve"> SEQ Figure \* ARABIC </w:instrText>
+      </w:r>
+      <w:r>
+        <w:fldChar w:fldCharType="separate"/>
+      </w:r>
+      <w:r>
+        <w:rPr>
+          <w:noProof/>
+        </w:rPr>
+        <w:t>2</w:t>
+      </w:r>
+      <w:r>
+        <w:rPr>
+          <w:noProof/>
+        </w:rPr>
+        <w:fldChar w:fldCharType="end"/>
+      </w:r>
       <w:bookmarkEnd w:id="4"/>
       <w:r>
         <w:t>: The output stage of the BJT curve tracer uses a current mirro</w:t>
@@ -1477,8 +1526,13 @@
       <w:r>
         <w:t xml:space="preserve"> </w:t>
       </w:r>
-      <w:r>
-        <w:t xml:space="preserve">kΩ resistor, setting the base current.  </w:t>
+      <w:proofErr w:type="spellStart"/>
+      <w:r>
+        <w:t>kΩ</w:t>
+      </w:r>
+      <w:proofErr w:type="spellEnd"/>
+      <w:r>
+        <w:t xml:space="preserve"> resistor, setting the base current.  </w:t>
       </w:r>
     </w:p>
     <w:p>
@@ -1549,13 +1603,7 @@
         <w:t xml:space="preserve"> the</w:t>
       </w:r>
       <w:r>
-        <w:t xml:space="preserve"> collector emitter voltage against the collector current</w:t>
-      </w:r>
-      <w:r>
-        <w:t xml:space="preserve"> is needed</w:t>
-      </w:r>
-      <w:r>
-        <w:t xml:space="preserve">.  This </w:t>
+        <w:t xml:space="preserve"> collector emitter voltage against the collector current.  This </w:t>
       </w:r>
       <w:r>
         <w:t xml:space="preserve">need </w:t>
@@ -1871,14 +1919,27 @@
       <w:r>
         <w:t xml:space="preserve">Figure </w:t>
       </w:r>
-      <w:fldSimple w:instr=" SEQ Figure \* ARABIC ">
-        <w:r>
-          <w:rPr>
-            <w:noProof/>
-          </w:rPr>
-          <w:t>3</w:t>
-        </w:r>
-      </w:fldSimple>
+      <w:r>
+        <w:fldChar w:fldCharType="begin"/>
+      </w:r>
+      <w:r>
+        <w:instrText xml:space="preserve"> SEQ Figure \* ARABIC </w:instrText>
+      </w:r>
+      <w:r>
+        <w:fldChar w:fldCharType="separate"/>
+      </w:r>
+      <w:r>
+        <w:rPr>
+          <w:noProof/>
+        </w:rPr>
+        <w:t>3</w:t>
+      </w:r>
+      <w:r>
+        <w:rPr>
+          <w:noProof/>
+        </w:rPr>
+        <w:fldChar w:fldCharType="end"/>
+      </w:r>
       <w:bookmarkEnd w:id="5"/>
       <w:r>
         <w:t xml:space="preserve">: A pair of signals on Channel 1 and </w:t>
@@ -1952,7 +2013,15 @@
         <w:fldChar w:fldCharType="end"/>
       </w:r>
       <w:r>
-        <w:t xml:space="preserve">, a blue circle is placed at (x,y) = (2V, </w:t>
+        <w:t>, a blue circle is placed at (</w:t>
+      </w:r>
+      <w:proofErr w:type="spellStart"/>
+      <w:r>
+        <w:t>x,y</w:t>
+      </w:r>
+      <w:proofErr w:type="spellEnd"/>
+      <w:r>
+        <w:t xml:space="preserve">) = (2V, </w:t>
       </w:r>
       <w:r>
         <w:t>0</w:t>
@@ -2196,14 +2265,27 @@
       <w:r>
         <w:t xml:space="preserve">Table </w:t>
       </w:r>
-      <w:fldSimple w:instr=" SEQ Table \* ARABIC ">
-        <w:r>
-          <w:rPr>
-            <w:noProof/>
-          </w:rPr>
-          <w:t>1</w:t>
-        </w:r>
-      </w:fldSimple>
+      <w:r>
+        <w:fldChar w:fldCharType="begin"/>
+      </w:r>
+      <w:r>
+        <w:instrText xml:space="preserve"> SEQ Table \* ARABIC </w:instrText>
+      </w:r>
+      <w:r>
+        <w:fldChar w:fldCharType="separate"/>
+      </w:r>
+      <w:r>
+        <w:rPr>
+          <w:noProof/>
+        </w:rPr>
+        <w:t>1</w:t>
+      </w:r>
+      <w:r>
+        <w:rPr>
+          <w:noProof/>
+        </w:rPr>
+        <w:fldChar w:fldCharType="end"/>
+      </w:r>
       <w:bookmarkEnd w:id="6"/>
       <w:r>
         <w:t xml:space="preserve">: The X,Y values of the curve in </w:t>
@@ -3205,14 +3287,27 @@
       <w:r>
         <w:t xml:space="preserve">Figure </w:t>
       </w:r>
-      <w:fldSimple w:instr=" SEQ Figure \* ARABIC ">
-        <w:r>
-          <w:rPr>
-            <w:noProof/>
-          </w:rPr>
-          <w:t>4</w:t>
-        </w:r>
-      </w:fldSimple>
+      <w:r>
+        <w:fldChar w:fldCharType="begin"/>
+      </w:r>
+      <w:r>
+        <w:instrText xml:space="preserve"> SEQ Figure \* ARABIC </w:instrText>
+      </w:r>
+      <w:r>
+        <w:fldChar w:fldCharType="separate"/>
+      </w:r>
+      <w:r>
+        <w:rPr>
+          <w:noProof/>
+        </w:rPr>
+        <w:t>4</w:t>
+      </w:r>
+      <w:r>
+        <w:rPr>
+          <w:noProof/>
+        </w:rPr>
+        <w:fldChar w:fldCharType="end"/>
+      </w:r>
       <w:bookmarkEnd w:id="8"/>
       <w:r>
         <w:t xml:space="preserve">: The oscilloscope </w:t>
@@ -3253,7 +3348,13 @@
         <w:rPr>
           <w:bCs/>
         </w:rPr>
-        <w:t>us to convert the picture on the oscilloscope screen to numerical values are</w:t>
+        <w:t xml:space="preserve">us to convert the picture on the oscilloscope screen to numerical values </w:t>
+      </w:r>
+      <w:r>
+        <w:rPr>
+          <w:bCs/>
+        </w:rPr>
+        <w:t>is</w:t>
       </w:r>
       <w:r>
         <w:rPr>
@@ -3396,14 +3497,27 @@
       <w:r>
         <w:t xml:space="preserve">Figure </w:t>
       </w:r>
-      <w:fldSimple w:instr=" SEQ Figure \* ARABIC ">
-        <w:r>
-          <w:rPr>
-            <w:noProof/>
-          </w:rPr>
-          <w:t>5</w:t>
-        </w:r>
-      </w:fldSimple>
+      <w:r>
+        <w:fldChar w:fldCharType="begin"/>
+      </w:r>
+      <w:r>
+        <w:instrText xml:space="preserve"> SEQ Figure \* ARABIC </w:instrText>
+      </w:r>
+      <w:r>
+        <w:fldChar w:fldCharType="separate"/>
+      </w:r>
+      <w:r>
+        <w:rPr>
+          <w:noProof/>
+        </w:rPr>
+        <w:t>5</w:t>
+      </w:r>
+      <w:r>
+        <w:rPr>
+          <w:noProof/>
+        </w:rPr>
+        <w:fldChar w:fldCharType="end"/>
+      </w:r>
       <w:bookmarkEnd w:id="9"/>
       <w:r>
         <w:t xml:space="preserve">: The circuit </w:t>
@@ -3457,7 +3571,7 @@
     </w:p>
     <w:p>
       <w:r>
-        <w:t>You will connect the Channel 1</w:t>
+        <w:t>You will connect Channel 1</w:t>
       </w:r>
       <w:r>
         <w:t xml:space="preserve"> of the oscilloscope to C</w:t>
@@ -3521,6 +3635,7 @@
       <w:r>
         <w:t xml:space="preserve"> Since the emitter of the DUT is at ground, CH_X is measuring </w:t>
       </w:r>
+      <w:proofErr w:type="spellStart"/>
       <w:r>
         <w:rPr>
           <w:i/>
@@ -3536,6 +3651,7 @@
         </w:rPr>
         <w:t>ce</w:t>
       </w:r>
+      <w:proofErr w:type="spellEnd"/>
       <w:r>
         <w:t xml:space="preserve"> of the DUT.  </w:t>
       </w:r>
@@ -3680,16 +3796,29 @@
               <w:pStyle w:val="Caption"/>
               <w:keepNext/>
             </w:pPr>
-            <w:fldSimple w:instr=" SEQ Equation \* ARABIC ">
-              <w:bookmarkStart w:id="10" w:name="_Ref96286407"/>
-              <w:r>
-                <w:rPr>
-                  <w:noProof/>
-                </w:rPr>
-                <w:t>1</w:t>
-              </w:r>
-              <w:bookmarkEnd w:id="10"/>
-            </w:fldSimple>
+            <w:r>
+              <w:fldChar w:fldCharType="begin"/>
+            </w:r>
+            <w:r>
+              <w:instrText xml:space="preserve"> SEQ Equation \* ARABIC </w:instrText>
+            </w:r>
+            <w:r>
+              <w:fldChar w:fldCharType="separate"/>
+            </w:r>
+            <w:bookmarkStart w:id="10" w:name="_Ref96286407"/>
+            <w:r>
+              <w:rPr>
+                <w:noProof/>
+              </w:rPr>
+              <w:t>1</w:t>
+            </w:r>
+            <w:bookmarkEnd w:id="10"/>
+            <w:r>
+              <w:rPr>
+                <w:noProof/>
+              </w:rPr>
+              <w:fldChar w:fldCharType="end"/>
+            </w:r>
           </w:p>
         </w:tc>
       </w:tr>
@@ -3728,7 +3857,7 @@
     </w:p>
     <w:p>
       <w:r>
-        <w:t>You will connect the Channel 2</w:t>
+        <w:t>You will connect Channel 2</w:t>
       </w:r>
       <w:r>
         <w:t xml:space="preserve"> of the oscilloscope to </w:t>
@@ -3795,6 +3924,7 @@
       <w:r>
         <w:t xml:space="preserve"> Since the current out of Q4 is the collector current, </w:t>
       </w:r>
+      <w:proofErr w:type="spellStart"/>
       <w:r>
         <w:t>i</w:t>
       </w:r>
@@ -3804,9 +3934,11 @@
         </w:rPr>
         <w:t>c</w:t>
       </w:r>
+      <w:proofErr w:type="spellEnd"/>
       <w:r>
         <w:t xml:space="preserve">, of the DUT then the current output of Q5 is also equal to </w:t>
       </w:r>
+      <w:proofErr w:type="spellStart"/>
       <w:r>
         <w:rPr>
           <w:i/>
@@ -3822,6 +3954,7 @@
         </w:rPr>
         <w:t>c</w:t>
       </w:r>
+      <w:proofErr w:type="spellEnd"/>
       <w:r>
         <w:t xml:space="preserve">.  Thus, </w:t>
       </w:r>
@@ -4055,16 +4188,29 @@
               <w:pStyle w:val="Caption"/>
               <w:keepNext/>
             </w:pPr>
-            <w:fldSimple w:instr=" SEQ Equation \* ARABIC ">
-              <w:bookmarkStart w:id="11" w:name="_Ref82953684"/>
-              <w:r>
-                <w:rPr>
-                  <w:noProof/>
-                </w:rPr>
-                <w:t>2</w:t>
-              </w:r>
-              <w:bookmarkEnd w:id="11"/>
-            </w:fldSimple>
+            <w:r>
+              <w:fldChar w:fldCharType="begin"/>
+            </w:r>
+            <w:r>
+              <w:instrText xml:space="preserve"> SEQ Equation \* ARABIC </w:instrText>
+            </w:r>
+            <w:r>
+              <w:fldChar w:fldCharType="separate"/>
+            </w:r>
+            <w:bookmarkStart w:id="11" w:name="_Ref82953684"/>
+            <w:r>
+              <w:rPr>
+                <w:noProof/>
+              </w:rPr>
+              <w:t>2</w:t>
+            </w:r>
+            <w:bookmarkEnd w:id="11"/>
+            <w:r>
+              <w:rPr>
+                <w:noProof/>
+              </w:rPr>
+              <w:fldChar w:fldCharType="end"/>
+            </w:r>
           </w:p>
         </w:tc>
       </w:tr>
@@ -4311,14 +4457,27 @@
               <w:pStyle w:val="Caption"/>
               <w:keepNext/>
             </w:pPr>
-            <w:fldSimple w:instr=" SEQ Equation \* ARABIC ">
-              <w:r>
-                <w:rPr>
-                  <w:noProof/>
-                </w:rPr>
-                <w:t>3</w:t>
-              </w:r>
-            </w:fldSimple>
+            <w:r>
+              <w:fldChar w:fldCharType="begin"/>
+            </w:r>
+            <w:r>
+              <w:instrText xml:space="preserve"> SEQ Equation \* ARABIC </w:instrText>
+            </w:r>
+            <w:r>
+              <w:fldChar w:fldCharType="separate"/>
+            </w:r>
+            <w:r>
+              <w:rPr>
+                <w:noProof/>
+              </w:rPr>
+              <w:t>3</w:t>
+            </w:r>
+            <w:r>
+              <w:rPr>
+                <w:noProof/>
+              </w:rPr>
+              <w:fldChar w:fldCharType="end"/>
+            </w:r>
           </w:p>
         </w:tc>
       </w:tr>
@@ -4349,7 +4508,11 @@
         <w:t xml:space="preserve"> two</w:t>
       </w:r>
       <w:r>
-        <w:t xml:space="preserve"> ideas just presented to determine V</w:t>
+        <w:t xml:space="preserve"> ideas just presented to determine </w:t>
+      </w:r>
+      <w:proofErr w:type="spellStart"/>
+      <w:r>
+        <w:t>V</w:t>
       </w:r>
       <w:r>
         <w:rPr>
@@ -4357,8 +4520,13 @@
         </w:rPr>
         <w:t>ce</w:t>
       </w:r>
-      <w:r>
-        <w:t xml:space="preserve"> and i</w:t>
+      <w:proofErr w:type="spellEnd"/>
+      <w:r>
+        <w:t xml:space="preserve"> and </w:t>
+      </w:r>
+      <w:proofErr w:type="spellStart"/>
+      <w:r>
+        <w:t>i</w:t>
       </w:r>
       <w:r>
         <w:rPr>
@@ -4366,6 +4534,7 @@
         </w:rPr>
         <w:t>c</w:t>
       </w:r>
+      <w:proofErr w:type="spellEnd"/>
       <w:r>
         <w:t xml:space="preserve"> of the points marked in </w:t>
       </w:r>
@@ -4420,16 +4589,37 @@
     </w:p>
     <w:p>
       <w:r>
-        <w:t>Now the orange square is located 1 division to the right of the red square, hence has a</w:t>
+        <w:t>Now</w:t>
+      </w:r>
+      <w:r>
+        <w:t>,</w:t>
+      </w:r>
+      <w:r>
+        <w:t xml:space="preserve"> the orange square is located 1 division to the right of the red square, hence</w:t>
+      </w:r>
+      <w:r>
+        <w:t xml:space="preserve"> it has</w:t>
+      </w:r>
+      <w:r>
+        <w:t xml:space="preserve"> a</w:t>
       </w:r>
       <w:r>
         <w:t>n</w:t>
       </w:r>
       <w:r>
-        <w:t xml:space="preserve"> x-axis voltage of 1V.  </w:t>
-      </w:r>
-      <w:r>
-        <w:t>Thus,</w:t>
+        <w:t xml:space="preserve"> x-axis voltage of 1V</w:t>
+      </w:r>
+      <w:r>
+        <w:t>;</w:t>
+      </w:r>
+      <w:r>
+        <w:t xml:space="preserve"> </w:t>
+      </w:r>
+      <w:r>
+        <w:t>t</w:t>
+      </w:r>
+      <w:r>
+        <w:t>hus,</w:t>
       </w:r>
       <w:r>
         <w:t xml:space="preserve"> by </w:t>
@@ -4438,7 +4628,11 @@
         <w:t>E</w:t>
       </w:r>
       <w:r>
-        <w:t>quation 1, V</w:t>
+        <w:t xml:space="preserve">quation 1, </w:t>
+      </w:r>
+      <w:proofErr w:type="spellStart"/>
+      <w:r>
+        <w:t>V</w:t>
       </w:r>
       <w:r>
         <w:rPr>
@@ -4446,6 +4640,7 @@
         </w:rPr>
         <w:t>ce</w:t>
       </w:r>
+      <w:proofErr w:type="spellEnd"/>
       <w:r>
         <w:t xml:space="preserve"> </w:t>
       </w:r>
@@ -4453,7 +4648,47 @@
         <w:t xml:space="preserve">= 1V. </w:t>
       </w:r>
       <w:r>
-        <w:t>The orange square is 4 divisions above the red square, hence has a y-axis voltage of 4division * 0.2V/division = 0.8V.  Hence, by Equation 4, i</w:t>
+        <w:t>The orange square is 4 divisions above the red square, hence</w:t>
+      </w:r>
+      <w:r>
+        <w:t>, it</w:t>
+      </w:r>
+      <w:r>
+        <w:t xml:space="preserve"> has a y-axis voltage of 4</w:t>
+      </w:r>
+      <w:r>
+        <w:t xml:space="preserve"> </w:t>
+      </w:r>
+      <w:r>
+        <w:t>division</w:t>
+      </w:r>
+      <w:r>
+        <w:t>s</w:t>
+      </w:r>
+      <w:r>
+        <w:t xml:space="preserve"> * 0.2V/division = 0.8V</w:t>
+      </w:r>
+      <w:r>
+        <w:t>;</w:t>
+      </w:r>
+      <w:r>
+        <w:t xml:space="preserve"> </w:t>
+      </w:r>
+      <w:r>
+        <w:t>h</w:t>
+      </w:r>
+      <w:r>
+        <w:t>ence</w:t>
+      </w:r>
+      <w:r>
+        <w:t>,</w:t>
+      </w:r>
+      <w:r>
+        <w:t xml:space="preserve"> by Equation 4, </w:t>
+      </w:r>
+      <w:proofErr w:type="spellStart"/>
+      <w:r>
+        <w:t>i</w:t>
       </w:r>
       <w:r>
         <w:rPr>
@@ -4461,6 +4696,7 @@
         </w:rPr>
         <w:t>c</w:t>
       </w:r>
+      <w:proofErr w:type="spellEnd"/>
       <w:r>
         <w:t xml:space="preserve"> = 0.8V * 10mA/volt = 8mA.</w:t>
       </w:r>
@@ -4537,17 +4773,34 @@
       <w:r>
         <w:t xml:space="preserve">Figure </w:t>
       </w:r>
-      <w:fldSimple w:instr=" SEQ Figure \* ARABIC ">
-        <w:r>
-          <w:rPr>
-            <w:noProof/>
-          </w:rPr>
-          <w:t>6</w:t>
-        </w:r>
-      </w:fldSimple>
+      <w:r>
+        <w:fldChar w:fldCharType="begin"/>
+      </w:r>
+      <w:r>
+        <w:instrText xml:space="preserve"> SEQ Figure \* ARABIC </w:instrText>
+      </w:r>
+      <w:r>
+        <w:fldChar w:fldCharType="separate"/>
+      </w:r>
+      <w:r>
+        <w:rPr>
+          <w:noProof/>
+        </w:rPr>
+        <w:t>6</w:t>
+      </w:r>
+      <w:r>
+        <w:rPr>
+          <w:noProof/>
+        </w:rPr>
+        <w:fldChar w:fldCharType="end"/>
+      </w:r>
       <w:bookmarkEnd w:id="13"/>
       <w:r>
-        <w:t>: A family of curves with colored squares marking points to determine V</w:t>
+        <w:t xml:space="preserve">: A family of curves with colored squares marking points to determine </w:t>
+      </w:r>
+      <w:proofErr w:type="spellStart"/>
+      <w:r>
+        <w:t>V</w:t>
       </w:r>
       <w:r>
         <w:rPr>
@@ -4555,8 +4808,13 @@
         </w:rPr>
         <w:t>ce</w:t>
       </w:r>
-      <w:r>
-        <w:t xml:space="preserve"> and i</w:t>
+      <w:proofErr w:type="spellEnd"/>
+      <w:r>
+        <w:t xml:space="preserve"> and </w:t>
+      </w:r>
+      <w:proofErr w:type="spellStart"/>
+      <w:r>
+        <w:t>i</w:t>
       </w:r>
       <w:r>
         <w:rPr>
@@ -4564,6 +4822,7 @@
         </w:rPr>
         <w:t>c</w:t>
       </w:r>
+      <w:proofErr w:type="spellEnd"/>
       <w:r>
         <w:t>.</w:t>
       </w:r>
@@ -4586,14 +4845,27 @@
         <w:lastRenderedPageBreak/>
         <w:t xml:space="preserve">Table </w:t>
       </w:r>
-      <w:fldSimple w:instr=" SEQ Table \* ARABIC ">
-        <w:r>
-          <w:rPr>
-            <w:noProof/>
-          </w:rPr>
-          <w:t>2</w:t>
-        </w:r>
-      </w:fldSimple>
+      <w:r>
+        <w:fldChar w:fldCharType="begin"/>
+      </w:r>
+      <w:r>
+        <w:instrText xml:space="preserve"> SEQ Table \* ARABIC </w:instrText>
+      </w:r>
+      <w:r>
+        <w:fldChar w:fldCharType="separate"/>
+      </w:r>
+      <w:r>
+        <w:rPr>
+          <w:noProof/>
+        </w:rPr>
+        <w:t>2</w:t>
+      </w:r>
+      <w:r>
+        <w:rPr>
+          <w:noProof/>
+        </w:rPr>
+        <w:fldChar w:fldCharType="end"/>
+      </w:r>
       <w:bookmarkEnd w:id="14"/>
       <w:r>
         <w:t xml:space="preserve">: Complete the table using the information in </w:t>
@@ -4678,6 +4950,7 @@
             <w:pPr>
               <w:ind w:left="0" w:firstLine="0"/>
             </w:pPr>
+            <w:proofErr w:type="spellStart"/>
             <w:r>
               <w:t>V</w:t>
             </w:r>
@@ -4687,6 +4960,7 @@
               </w:rPr>
               <w:t>ce</w:t>
             </w:r>
+            <w:proofErr w:type="spellEnd"/>
           </w:p>
         </w:tc>
         <w:tc>
@@ -4716,6 +4990,7 @@
             <w:pPr>
               <w:ind w:left="0" w:firstLine="0"/>
             </w:pPr>
+            <w:proofErr w:type="spellStart"/>
             <w:r>
               <w:t>i</w:t>
             </w:r>
@@ -4725,6 +5000,7 @@
               </w:rPr>
               <w:t>c</w:t>
             </w:r>
+            <w:proofErr w:type="spellEnd"/>
           </w:p>
         </w:tc>
       </w:tr>
@@ -5316,16 +5592,29 @@
               <w:pStyle w:val="Caption"/>
               <w:keepNext/>
             </w:pPr>
-            <w:fldSimple w:instr=" SEQ Equation \* ARABIC ">
-              <w:bookmarkStart w:id="15" w:name="_Ref82953727"/>
-              <w:r>
-                <w:rPr>
-                  <w:noProof/>
-                </w:rPr>
-                <w:t>4</w:t>
-              </w:r>
-              <w:bookmarkEnd w:id="15"/>
-            </w:fldSimple>
+            <w:r>
+              <w:fldChar w:fldCharType="begin"/>
+            </w:r>
+            <w:r>
+              <w:instrText xml:space="preserve"> SEQ Equation \* ARABIC </w:instrText>
+            </w:r>
+            <w:r>
+              <w:fldChar w:fldCharType="separate"/>
+            </w:r>
+            <w:bookmarkStart w:id="15" w:name="_Ref82953727"/>
+            <w:r>
+              <w:rPr>
+                <w:noProof/>
+              </w:rPr>
+              <w:t>4</w:t>
+            </w:r>
+            <w:bookmarkEnd w:id="15"/>
+            <w:r>
+              <w:rPr>
+                <w:noProof/>
+              </w:rPr>
+              <w:fldChar w:fldCharType="end"/>
+            </w:r>
           </w:p>
         </w:tc>
       </w:tr>
@@ -5368,6 +5657,7 @@
         </w:rPr>
         <w:t xml:space="preserve"> </w:t>
       </w:r>
+      <w:proofErr w:type="spellStart"/>
       <w:r>
         <w:rPr>
           <w:i/>
@@ -5383,6 +5673,7 @@
         </w:rPr>
         <w:t>b</w:t>
       </w:r>
+      <w:proofErr w:type="spellEnd"/>
       <w:r>
         <w:t xml:space="preserve"> yields Equation </w:t>
       </w:r>
@@ -5556,16 +5847,29 @@
               <w:pStyle w:val="Caption"/>
               <w:keepNext/>
             </w:pPr>
-            <w:fldSimple w:instr=" SEQ Equation \* ARABIC ">
-              <w:bookmarkStart w:id="16" w:name="_Ref82953742"/>
-              <w:r>
-                <w:rPr>
-                  <w:noProof/>
-                </w:rPr>
-                <w:t>5</w:t>
-              </w:r>
-              <w:bookmarkEnd w:id="16"/>
-            </w:fldSimple>
+            <w:r>
+              <w:fldChar w:fldCharType="begin"/>
+            </w:r>
+            <w:r>
+              <w:instrText xml:space="preserve"> SEQ Equation \* ARABIC </w:instrText>
+            </w:r>
+            <w:r>
+              <w:fldChar w:fldCharType="separate"/>
+            </w:r>
+            <w:bookmarkStart w:id="16" w:name="_Ref82953742"/>
+            <w:r>
+              <w:rPr>
+                <w:noProof/>
+              </w:rPr>
+              <w:t>5</w:t>
+            </w:r>
+            <w:bookmarkEnd w:id="16"/>
+            <w:r>
+              <w:rPr>
+                <w:noProof/>
+              </w:rPr>
+              <w:fldChar w:fldCharType="end"/>
+            </w:r>
           </w:p>
         </w:tc>
       </w:tr>
@@ -6152,14 +6456,27 @@
       <w:r>
         <w:t xml:space="preserve">Figure </w:t>
       </w:r>
-      <w:fldSimple w:instr=" SEQ Figure \* ARABIC ">
-        <w:r>
-          <w:rPr>
-            <w:noProof/>
-          </w:rPr>
-          <w:t>7</w:t>
-        </w:r>
-      </w:fldSimple>
+      <w:r>
+        <w:fldChar w:fldCharType="begin"/>
+      </w:r>
+      <w:r>
+        <w:instrText xml:space="preserve"> SEQ Figure \* ARABIC </w:instrText>
+      </w:r>
+      <w:r>
+        <w:fldChar w:fldCharType="separate"/>
+      </w:r>
+      <w:r>
+        <w:rPr>
+          <w:noProof/>
+        </w:rPr>
+        <w:t>7</w:t>
+      </w:r>
+      <w:r>
+        <w:rPr>
+          <w:noProof/>
+        </w:rPr>
+        <w:fldChar w:fldCharType="end"/>
+      </w:r>
       <w:bookmarkEnd w:id="18"/>
       <w:r>
         <w:t xml:space="preserve">: Measuring the </w:t>
@@ -6314,14 +6631,27 @@
       <w:r>
         <w:t xml:space="preserve">Table </w:t>
       </w:r>
-      <w:fldSimple w:instr=" SEQ Table \* ARABIC ">
-        <w:r>
-          <w:rPr>
-            <w:noProof/>
-          </w:rPr>
-          <w:t>3</w:t>
-        </w:r>
-      </w:fldSimple>
+      <w:r>
+        <w:fldChar w:fldCharType="begin"/>
+      </w:r>
+      <w:r>
+        <w:instrText xml:space="preserve"> SEQ Table \* ARABIC </w:instrText>
+      </w:r>
+      <w:r>
+        <w:fldChar w:fldCharType="separate"/>
+      </w:r>
+      <w:r>
+        <w:rPr>
+          <w:noProof/>
+        </w:rPr>
+        <w:t>3</w:t>
+      </w:r>
+      <w:r>
+        <w:rPr>
+          <w:noProof/>
+        </w:rPr>
+        <w:fldChar w:fldCharType="end"/>
+      </w:r>
       <w:bookmarkStart w:id="21" w:name="_Hlk83234397"/>
       <w:bookmarkEnd w:id="20"/>
       <w:r>
@@ -6451,6 +6781,7 @@
                 <w:bCs/>
               </w:rPr>
             </w:pPr>
+            <w:proofErr w:type="spellStart"/>
             <w:r>
               <w:rPr>
                 <w:b/>
@@ -6470,6 +6801,7 @@
               </w:rPr>
               <w:t>b</w:t>
             </w:r>
+            <w:proofErr w:type="spellEnd"/>
             <w:r>
               <w:rPr>
                 <w:b/>
@@ -6972,7 +7304,11 @@
         <w:fldChar w:fldCharType="end"/>
       </w:r>
       <w:r>
-        <w:t xml:space="preserve"> to compute the base current, i</w:t>
+        <w:t xml:space="preserve"> to compute the base current, </w:t>
+      </w:r>
+      <w:proofErr w:type="spellStart"/>
+      <w:r>
+        <w:t>i</w:t>
       </w:r>
       <w:r>
         <w:rPr>
@@ -6980,6 +7316,7 @@
         </w:rPr>
         <w:t>b</w:t>
       </w:r>
+      <w:proofErr w:type="spellEnd"/>
       <w:r>
         <w:t xml:space="preserve">, using Equation </w:t>
       </w:r>
@@ -7087,7 +7424,13 @@
         <w:t>By completing the BJT performance card, you will be able to determine t</w:t>
       </w:r>
       <w:r>
-        <w:t xml:space="preserve">wo important parameters of the BJT under test, the DC gain and the Early voltage.    To determine these parameters, download and open </w:t>
+        <w:t>wo important parameters of the BJT under test, the DC gain and the Early voltage.</w:t>
+      </w:r>
+      <w:r>
+        <w:t xml:space="preserve"> </w:t>
+      </w:r>
+      <w:r>
+        <w:t xml:space="preserve">To determine these parameters, download and open </w:t>
       </w:r>
       <w:r>
         <w:t>the bjtPerformanceCard</w:t>
@@ -7194,6 +7537,7 @@
         </w:rPr>
         <w:t xml:space="preserve"> to fill in the </w:t>
       </w:r>
+      <w:proofErr w:type="spellStart"/>
       <w:r>
         <w:rPr>
           <w:i/>
@@ -7211,6 +7555,7 @@
         </w:rPr>
         <w:t>b</w:t>
       </w:r>
+      <w:proofErr w:type="spellEnd"/>
       <w:r>
         <w:rPr>
           <w:i/>
@@ -7368,7 +7713,15 @@
         <w:t xml:space="preserve"> save a personal copy of </w:t>
       </w:r>
       <w:r>
-        <w:t>the bjtPerformanceCard document with this information typed in permanently.</w:t>
+        <w:t xml:space="preserve">the </w:t>
+      </w:r>
+      <w:proofErr w:type="spellStart"/>
+      <w:r>
+        <w:t>bjtPerformanceCard</w:t>
+      </w:r>
+      <w:proofErr w:type="spellEnd"/>
+      <w:r>
+        <w:t xml:space="preserve"> document with this information typed in permanently.</w:t>
       </w:r>
       <w:r>
         <w:t xml:space="preserve">  </w:t>
@@ -7430,14 +7783,27 @@
       <w:r>
         <w:t xml:space="preserve">Figure </w:t>
       </w:r>
-      <w:fldSimple w:instr=" SEQ Figure \* ARABIC ">
-        <w:r>
-          <w:rPr>
-            <w:noProof/>
-          </w:rPr>
-          <w:t>8</w:t>
-        </w:r>
-      </w:fldSimple>
+      <w:r>
+        <w:fldChar w:fldCharType="begin"/>
+      </w:r>
+      <w:r>
+        <w:instrText xml:space="preserve"> SEQ Figure \* ARABIC </w:instrText>
+      </w:r>
+      <w:r>
+        <w:fldChar w:fldCharType="separate"/>
+      </w:r>
+      <w:r>
+        <w:rPr>
+          <w:noProof/>
+        </w:rPr>
+        <w:t>8</w:t>
+      </w:r>
+      <w:r>
+        <w:rPr>
+          <w:noProof/>
+        </w:rPr>
+        <w:fldChar w:fldCharType="end"/>
+      </w:r>
       <w:bookmarkEnd w:id="22"/>
       <w:r>
         <w:t xml:space="preserve">: The BJT Performance card you will </w:t>
@@ -7602,6 +7968,7 @@
               </w:rPr>
               <w:t xml:space="preserve"> </w:t>
             </w:r>
+            <w:proofErr w:type="spellStart"/>
             <w:r>
               <w:rPr>
                 <w:b w:val="0"/>
@@ -7609,6 +7976,7 @@
               </w:rPr>
               <w:t>ms</w:t>
             </w:r>
+            <w:proofErr w:type="spellEnd"/>
           </w:p>
         </w:tc>
       </w:tr>
@@ -8074,14 +8442,27 @@
       <w:r>
         <w:t xml:space="preserve">Figure </w:t>
       </w:r>
-      <w:fldSimple w:instr=" SEQ Figure \* ARABIC ">
-        <w:r>
-          <w:rPr>
-            <w:noProof/>
-          </w:rPr>
-          <w:t>9</w:t>
-        </w:r>
-      </w:fldSimple>
+      <w:r>
+        <w:fldChar w:fldCharType="begin"/>
+      </w:r>
+      <w:r>
+        <w:instrText xml:space="preserve"> SEQ Figure \* ARABIC </w:instrText>
+      </w:r>
+      <w:r>
+        <w:fldChar w:fldCharType="separate"/>
+      </w:r>
+      <w:r>
+        <w:rPr>
+          <w:noProof/>
+        </w:rPr>
+        <w:t>9</w:t>
+      </w:r>
+      <w:r>
+        <w:rPr>
+          <w:noProof/>
+        </w:rPr>
+        <w:fldChar w:fldCharType="end"/>
+      </w:r>
       <w:bookmarkEnd w:id="23"/>
       <w:r>
         <w:t>: The oscilloscope output with a DUT in normal mode</w:t>
@@ -8100,6 +8481,7 @@
       <w:r>
         <w:t xml:space="preserve"> you will need to put the oscilloscope into X/Y mode. Find the </w:t>
       </w:r>
+      <w:proofErr w:type="spellStart"/>
       <w:r>
         <w:rPr>
           <w:b/>
@@ -8107,6 +8489,7 @@
         </w:rPr>
         <w:t>Horiz</w:t>
       </w:r>
+      <w:proofErr w:type="spellEnd"/>
       <w:r>
         <w:t xml:space="preserve"> button and then use the softkey menu to select X</w:t>
       </w:r>
@@ -8167,17 +8550,38 @@
       <w:r>
         <w:t xml:space="preserve">Figure </w:t>
       </w:r>
-      <w:fldSimple w:instr=" SEQ Figure \* ARABIC ">
-        <w:r>
-          <w:rPr>
-            <w:noProof/>
-          </w:rPr>
-          <w:t>10</w:t>
-        </w:r>
-      </w:fldSimple>
+      <w:r>
+        <w:fldChar w:fldCharType="begin"/>
+      </w:r>
+      <w:r>
+        <w:instrText xml:space="preserve"> SEQ Figure \* ARABIC </w:instrText>
+      </w:r>
+      <w:r>
+        <w:fldChar w:fldCharType="separate"/>
+      </w:r>
+      <w:r>
+        <w:rPr>
+          <w:noProof/>
+        </w:rPr>
+        <w:t>10</w:t>
+      </w:r>
+      <w:r>
+        <w:rPr>
+          <w:noProof/>
+        </w:rPr>
+        <w:fldChar w:fldCharType="end"/>
+      </w:r>
       <w:bookmarkEnd w:id="24"/>
       <w:r>
-        <w:t>: Display showing the placement of the Horiz button.</w:t>
+        <w:t xml:space="preserve">: Display showing the placement of the </w:t>
+      </w:r>
+      <w:proofErr w:type="spellStart"/>
+      <w:r>
+        <w:t>Horiz</w:t>
+      </w:r>
+      <w:proofErr w:type="spellEnd"/>
+      <w:r>
+        <w:t xml:space="preserve"> button.</w:t>
       </w:r>
     </w:p>
     <w:p>
@@ -8219,7 +8623,7 @@
         </w:rPr>
         <w:lastRenderedPageBreak/>
         <w:drawing>
-          <wp:inline distT="0" distB="0" distL="0" distR="0" wp14:anchorId="4F88E10A" wp14:editId="1FCAAFB5">
+          <wp:inline distT="0" distB="0" distL="0" distR="0" wp14:anchorId="4F88E10A" wp14:editId="04096EF1">
             <wp:extent cx="2743200" cy="1754065"/>
             <wp:effectExtent l="0" t="0" r="0" b="0"/>
             <wp:docPr id="1" name="Picture 1"/>
@@ -8276,14 +8680,27 @@
       <w:r>
         <w:t xml:space="preserve">Figure </w:t>
       </w:r>
-      <w:fldSimple w:instr=" SEQ Figure \* ARABIC ">
-        <w:r>
-          <w:rPr>
-            <w:noProof/>
-          </w:rPr>
-          <w:t>11</w:t>
-        </w:r>
-      </w:fldSimple>
+      <w:r>
+        <w:fldChar w:fldCharType="begin"/>
+      </w:r>
+      <w:r>
+        <w:instrText xml:space="preserve"> SEQ Figure \* ARABIC </w:instrText>
+      </w:r>
+      <w:r>
+        <w:fldChar w:fldCharType="separate"/>
+      </w:r>
+      <w:r>
+        <w:rPr>
+          <w:noProof/>
+        </w:rPr>
+        <w:t>11</w:t>
+      </w:r>
+      <w:r>
+        <w:rPr>
+          <w:noProof/>
+        </w:rPr>
+        <w:fldChar w:fldCharType="end"/>
+      </w:r>
       <w:bookmarkEnd w:id="25"/>
       <w:r>
         <w:t>: X-Y mode when first ena</w:t>
@@ -8330,7 +8747,7 @@
           <w:noProof/>
         </w:rPr>
         <w:drawing>
-          <wp:inline distT="0" distB="0" distL="0" distR="0" wp14:anchorId="70D8E959" wp14:editId="2CCBC17D">
+          <wp:inline distT="0" distB="0" distL="0" distR="0" wp14:anchorId="70D8E959" wp14:editId="26A0DB4A">
             <wp:extent cx="2743200" cy="1754065"/>
             <wp:effectExtent l="0" t="0" r="0" b="0"/>
             <wp:docPr id="19" name="Picture 19"/>
@@ -8387,14 +8804,27 @@
       <w:r>
         <w:t xml:space="preserve">Figure </w:t>
       </w:r>
-      <w:fldSimple w:instr=" SEQ Figure \* ARABIC ">
-        <w:r>
-          <w:rPr>
-            <w:noProof/>
-          </w:rPr>
-          <w:t>12</w:t>
-        </w:r>
-      </w:fldSimple>
+      <w:r>
+        <w:fldChar w:fldCharType="begin"/>
+      </w:r>
+      <w:r>
+        <w:instrText xml:space="preserve"> SEQ Figure \* ARABIC </w:instrText>
+      </w:r>
+      <w:r>
+        <w:fldChar w:fldCharType="separate"/>
+      </w:r>
+      <w:r>
+        <w:rPr>
+          <w:noProof/>
+        </w:rPr>
+        <w:t>12</w:t>
+      </w:r>
+      <w:r>
+        <w:rPr>
+          <w:noProof/>
+        </w:rPr>
+        <w:fldChar w:fldCharType="end"/>
+      </w:r>
       <w:bookmarkEnd w:id="26"/>
       <w:r>
         <w:t>: Use the Channel 1/</w:t>
@@ -8468,7 +8898,7 @@
           <w:noProof/>
         </w:rPr>
         <w:drawing>
-          <wp:inline distT="0" distB="0" distL="0" distR="0" wp14:anchorId="72714103" wp14:editId="01DD95E2">
+          <wp:inline distT="0" distB="0" distL="0" distR="0" wp14:anchorId="72714103" wp14:editId="79F77DC5">
             <wp:extent cx="2743200" cy="1754066"/>
             <wp:effectExtent l="0" t="0" r="0" b="0"/>
             <wp:docPr id="25" name="Picture 25"/>
@@ -8525,14 +8955,27 @@
       <w:r>
         <w:t xml:space="preserve">Figure </w:t>
       </w:r>
-      <w:fldSimple w:instr=" SEQ Figure \* ARABIC ">
-        <w:r>
-          <w:rPr>
-            <w:noProof/>
-          </w:rPr>
-          <w:t>13</w:t>
-        </w:r>
-      </w:fldSimple>
+      <w:r>
+        <w:fldChar w:fldCharType="begin"/>
+      </w:r>
+      <w:r>
+        <w:instrText xml:space="preserve"> SEQ Figure \* ARABIC </w:instrText>
+      </w:r>
+      <w:r>
+        <w:fldChar w:fldCharType="separate"/>
+      </w:r>
+      <w:r>
+        <w:rPr>
+          <w:noProof/>
+        </w:rPr>
+        <w:t>13</w:t>
+      </w:r>
+      <w:r>
+        <w:rPr>
+          <w:noProof/>
+        </w:rPr>
+        <w:fldChar w:fldCharType="end"/>
+      </w:r>
       <w:bookmarkEnd w:id="27"/>
       <w:r>
         <w:t>: Use the Channel 1/2 offs</w:t>
@@ -8643,7 +9086,7 @@
         </w:rPr>
         <w:lastRenderedPageBreak/>
         <w:drawing>
-          <wp:anchor distT="0" distB="0" distL="114300" distR="114300" simplePos="0" relativeHeight="251660288" behindDoc="0" locked="0" layoutInCell="1" allowOverlap="1" wp14:anchorId="44ABC0DE" wp14:editId="69587717">
+          <wp:anchor distT="0" distB="0" distL="114300" distR="114300" simplePos="0" relativeHeight="251660288" behindDoc="0" locked="0" layoutInCell="1" allowOverlap="1" wp14:anchorId="44ABC0DE" wp14:editId="3A6619C5">
             <wp:simplePos x="0" y="0"/>
             <wp:positionH relativeFrom="column">
               <wp:posOffset>3055620</wp:posOffset>
@@ -8710,7 +9153,7 @@
           <w:noProof/>
         </w:rPr>
         <w:drawing>
-          <wp:inline distT="0" distB="0" distL="0" distR="0" wp14:anchorId="1A6A59AC" wp14:editId="6C2BDA09">
+          <wp:inline distT="0" distB="0" distL="0" distR="0" wp14:anchorId="1A6A59AC" wp14:editId="0B1EDF38">
             <wp:extent cx="2743200" cy="1754945"/>
             <wp:effectExtent l="0" t="0" r="0" b="0"/>
             <wp:docPr id="2057669509" name="Picture 1"/>
@@ -8767,14 +9210,27 @@
       <w:r>
         <w:t xml:space="preserve">Figure </w:t>
       </w:r>
-      <w:fldSimple w:instr=" SEQ Figure \* ARABIC ">
-        <w:r>
-          <w:rPr>
-            <w:noProof/>
-          </w:rPr>
-          <w:t>14</w:t>
-        </w:r>
-      </w:fldSimple>
+      <w:r>
+        <w:fldChar w:fldCharType="begin"/>
+      </w:r>
+      <w:r>
+        <w:instrText xml:space="preserve"> SEQ Figure \* ARABIC </w:instrText>
+      </w:r>
+      <w:r>
+        <w:fldChar w:fldCharType="separate"/>
+      </w:r>
+      <w:r>
+        <w:rPr>
+          <w:noProof/>
+        </w:rPr>
+        <w:t>14</w:t>
+      </w:r>
+      <w:r>
+        <w:rPr>
+          <w:noProof/>
+        </w:rPr>
+        <w:fldChar w:fldCharType="end"/>
+      </w:r>
       <w:bookmarkEnd w:id="28"/>
       <w:r>
         <w:t xml:space="preserve">: Use the intensity (left) or High Resolution Mode to </w:t>
@@ -8820,7 +9276,15 @@
         <w:ind w:left="0" w:firstLine="0"/>
       </w:pPr>
       <w:r>
-        <w:t>You will need to measure the collector current for each curve at Vce = 1v.  Start by enabling the cursor function by pressing the Cursor hard key.  Pressing the Cursor so</w:t>
+        <w:t xml:space="preserve">You will need to measure the collector current for each curve at </w:t>
+      </w:r>
+      <w:proofErr w:type="spellStart"/>
+      <w:r>
+        <w:t>Vce</w:t>
+      </w:r>
+      <w:proofErr w:type="spellEnd"/>
+      <w:r>
+        <w:t xml:space="preserve"> = 1v.  Start by enabling the cursor function by pressing the Cursor hard key.  Pressing the Cursor so</w:t>
       </w:r>
       <w:r>
         <w:t>ft key brings up a menu of the four</w:t>
@@ -8832,7 +9296,15 @@
         <w:t>change</w:t>
       </w:r>
       <w:r>
-        <w:t xml:space="preserve"> the active cursor using the adjust knob (has a green illuminate circular arrow next to it).  You can adjust the position of the active cursors using the Measure knob.  Start by adjusting the X1 and Y1 cursors to 0v (look at the lower right area of the display to see the voltage of each cursor).  Next adjust the X2 cursor to 1v; this makes the X2 cursor lie at Vce = 1V.  Finally adjust the Y2 cursor to the intersection of the X2 cursor and the curve you whose collector current you want to measure.</w:t>
+        <w:t xml:space="preserve"> the active cursor using the adjust knob (has a green illuminate circular arrow next to it).  You can adjust the position of the active cursors using the Measure knob.  Start by adjusting the X1 and Y1 cursors to 0v (look at the lower right area of the display to see the voltage of each cursor).  Next adjust the X2 cursor to 1v; this makes the X2 cursor lie at </w:t>
+      </w:r>
+      <w:proofErr w:type="spellStart"/>
+      <w:r>
+        <w:t>Vce</w:t>
+      </w:r>
+      <w:proofErr w:type="spellEnd"/>
+      <w:r>
+        <w:t xml:space="preserve"> = 1V.  Finally adjust the Y2 cursor to the intersection of the X2 cursor and the curve you whose collector current you want to measure.</w:t>
       </w:r>
     </w:p>
     <w:p>
@@ -8902,14 +9374,27 @@
       <w:r>
         <w:t xml:space="preserve">Figure </w:t>
       </w:r>
-      <w:fldSimple w:instr=" SEQ Figure \* ARABIC ">
-        <w:r>
-          <w:rPr>
-            <w:noProof/>
-          </w:rPr>
-          <w:t>15</w:t>
-        </w:r>
-      </w:fldSimple>
+      <w:r>
+        <w:fldChar w:fldCharType="begin"/>
+      </w:r>
+      <w:r>
+        <w:instrText xml:space="preserve"> SEQ Figure \* ARABIC </w:instrText>
+      </w:r>
+      <w:r>
+        <w:fldChar w:fldCharType="separate"/>
+      </w:r>
+      <w:r>
+        <w:rPr>
+          <w:noProof/>
+        </w:rPr>
+        <w:t>15</w:t>
+      </w:r>
+      <w:r>
+        <w:rPr>
+          <w:noProof/>
+        </w:rPr>
+        <w:fldChar w:fldCharType="end"/>
+      </w:r>
       <w:bookmarkEnd w:id="29"/>
       <w:r>
         <w:t>: Using the cursors to measure the collector current of the 3rd curve.</w:t>
@@ -9141,7 +9626,14 @@
         <w:rPr>
           <w:color w:val="00B050"/>
         </w:rPr>
-        <w:t>recording the voltage of each curve as it passes V</w:t>
+        <w:t xml:space="preserve">recording the voltage of each curve as it passes </w:t>
+      </w:r>
+      <w:proofErr w:type="spellStart"/>
+      <w:r>
+        <w:rPr>
+          <w:color w:val="00B050"/>
+        </w:rPr>
+        <w:t>V</w:t>
       </w:r>
       <w:r>
         <w:rPr>
@@ -9150,6 +9642,7 @@
         </w:rPr>
         <w:t>ce</w:t>
       </w:r>
+      <w:proofErr w:type="spellEnd"/>
       <w:r>
         <w:rPr>
           <w:color w:val="00B050"/>
@@ -9173,14 +9666,27 @@
       <w:r>
         <w:t xml:space="preserve">Table </w:t>
       </w:r>
-      <w:fldSimple w:instr=" SEQ Table \* ARABIC ">
-        <w:r>
-          <w:rPr>
-            <w:noProof/>
-          </w:rPr>
-          <w:t>4</w:t>
-        </w:r>
-      </w:fldSimple>
+      <w:r>
+        <w:fldChar w:fldCharType="begin"/>
+      </w:r>
+      <w:r>
+        <w:instrText xml:space="preserve"> SEQ Table \* ARABIC </w:instrText>
+      </w:r>
+      <w:r>
+        <w:fldChar w:fldCharType="separate"/>
+      </w:r>
+      <w:r>
+        <w:rPr>
+          <w:noProof/>
+        </w:rPr>
+        <w:t>4</w:t>
+      </w:r>
+      <w:r>
+        <w:rPr>
+          <w:noProof/>
+        </w:rPr>
+        <w:fldChar w:fldCharType="end"/>
+      </w:r>
       <w:bookmarkEnd w:id="30"/>
       <w:r>
         <w:t xml:space="preserve">: The Gain Calculation table filled in using the information from </w:t>
@@ -9340,6 +9846,7 @@
                 <w:bCs/>
               </w:rPr>
             </w:pPr>
+            <w:proofErr w:type="spellStart"/>
             <w:r>
               <w:rPr>
                 <w:b/>
@@ -9359,6 +9866,7 @@
               </w:rPr>
               <w:t>c</w:t>
             </w:r>
+            <w:proofErr w:type="spellEnd"/>
             <w:r>
               <w:t>(mA)</w:t>
             </w:r>
@@ -9378,6 +9886,7 @@
                 <w:iCs/>
               </w:rPr>
             </w:pPr>
+            <w:proofErr w:type="spellStart"/>
             <w:r>
               <w:rPr>
                 <w:b/>
@@ -9397,8 +9906,17 @@
               </w:rPr>
               <w:t>b</w:t>
             </w:r>
-            <w:r>
-              <w:t>(uA)</w:t>
+            <w:proofErr w:type="spellEnd"/>
+            <w:r>
+              <w:t>(</w:t>
+            </w:r>
+            <w:proofErr w:type="spellStart"/>
+            <w:r>
+              <w:t>uA</w:t>
+            </w:r>
+            <w:proofErr w:type="spellEnd"/>
+            <w:r>
+              <w:t>)</w:t>
             </w:r>
           </w:p>
         </w:tc>
@@ -9414,6 +9932,7 @@
                 <w:bCs/>
               </w:rPr>
             </w:pPr>
+            <w:proofErr w:type="spellStart"/>
             <w:r>
               <w:rPr>
                 <w:b/>
@@ -9433,6 +9952,7 @@
               </w:rPr>
               <w:t>c</w:t>
             </w:r>
+            <w:proofErr w:type="spellEnd"/>
             <w:r>
               <w:rPr>
                 <w:b/>
@@ -9461,6 +9981,7 @@
               </w:rPr>
               <w:t xml:space="preserve"> </w:t>
             </w:r>
+            <w:proofErr w:type="spellStart"/>
             <w:r>
               <w:rPr>
                 <w:b/>
@@ -9480,6 +10001,7 @@
               </w:rPr>
               <w:t>b</w:t>
             </w:r>
+            <w:proofErr w:type="spellEnd"/>
           </w:p>
         </w:tc>
       </w:tr>
@@ -10002,6 +10524,7 @@
         </w:rPr>
         <w:t xml:space="preserve">in the collector current column, </w:t>
       </w:r>
+      <w:proofErr w:type="spellStart"/>
       <w:r>
         <w:rPr>
           <w:i/>
@@ -10019,6 +10542,7 @@
         </w:rPr>
         <w:t>c</w:t>
       </w:r>
+      <w:proofErr w:type="spellEnd"/>
       <w:r>
         <w:rPr>
           <w:i/>
@@ -10174,7 +10698,14 @@
         <w:rPr>
           <w:color w:val="00B050"/>
         </w:rPr>
-        <w:t xml:space="preserve"> into the i</w:t>
+        <w:t xml:space="preserve"> into the </w:t>
+      </w:r>
+      <w:proofErr w:type="spellStart"/>
+      <w:r>
+        <w:rPr>
+          <w:color w:val="00B050"/>
+        </w:rPr>
+        <w:t>i</w:t>
       </w:r>
       <w:r>
         <w:rPr>
@@ -10183,6 +10714,7 @@
         </w:rPr>
         <w:t>b</w:t>
       </w:r>
+      <w:proofErr w:type="spellEnd"/>
       <w:r>
         <w:rPr>
           <w:color w:val="00B050"/>
@@ -10228,6 +10760,7 @@
         </w:rPr>
         <w:t xml:space="preserve"> the </w:t>
       </w:r>
+      <w:proofErr w:type="spellStart"/>
       <w:r>
         <w:rPr>
           <w:i/>
@@ -10245,6 +10778,7 @@
         </w:rPr>
         <w:t>c</w:t>
       </w:r>
+      <w:proofErr w:type="spellEnd"/>
       <w:r>
         <w:rPr>
           <w:i/>
@@ -10270,6 +10804,7 @@
         </w:rPr>
         <w:t xml:space="preserve"> </w:t>
       </w:r>
+      <w:proofErr w:type="spellStart"/>
       <w:r>
         <w:rPr>
           <w:i/>
@@ -10287,6 +10822,7 @@
         </w:rPr>
         <w:t>b</w:t>
       </w:r>
+      <w:proofErr w:type="spellEnd"/>
       <w:r>
         <w:rPr>
           <w:i/>
@@ -10329,7 +10865,35 @@
         <w:rPr>
           <w:color w:val="00B050"/>
         </w:rPr>
-        <w:t xml:space="preserve">  Make sure you account for the change in units; mA for the collector current and uA for the base current.</w:t>
+        <w:t xml:space="preserve">  Make sure </w:t>
+      </w:r>
+      <w:proofErr w:type="spellStart"/>
+      <w:r>
+        <w:rPr>
+          <w:color w:val="00B050"/>
+        </w:rPr>
+        <w:t>you</w:t>
+      </w:r>
+      <w:proofErr w:type="spellEnd"/>
+      <w:r>
+        <w:rPr>
+          <w:color w:val="00B050"/>
+        </w:rPr>
+        <w:t xml:space="preserve"> account for the change in units; mA for the collector current and </w:t>
+      </w:r>
+      <w:proofErr w:type="spellStart"/>
+      <w:r>
+        <w:rPr>
+          <w:color w:val="00B050"/>
+        </w:rPr>
+        <w:t>uA</w:t>
+      </w:r>
+      <w:proofErr w:type="spellEnd"/>
+      <w:r>
+        <w:rPr>
+          <w:color w:val="00B050"/>
+        </w:rPr>
+        <w:t xml:space="preserve"> for the base current.</w:t>
       </w:r>
     </w:p>
     <w:p>
@@ -10389,7 +10953,19 @@
         <w:t xml:space="preserve">e almost-horizontal portion of the characteristic curve </w:t>
       </w:r>
       <w:r>
-        <w:t>will intersect the horizontal axis, the Early voltage.  In the black curve</w:t>
+        <w:t xml:space="preserve">and where it </w:t>
+      </w:r>
+      <w:r>
+        <w:t>will intersect the horizontal axis</w:t>
+      </w:r>
+      <w:r>
+        <w:t xml:space="preserve">. </w:t>
+      </w:r>
+      <w:r>
+        <w:t>T</w:t>
+      </w:r>
+      <w:r>
+        <w:t>he black curve</w:t>
       </w:r>
       <w:r>
         <w:t xml:space="preserve"> in</w:t>
@@ -10517,14 +11093,27 @@
       <w:r>
         <w:t xml:space="preserve">Figure </w:t>
       </w:r>
-      <w:fldSimple w:instr=" SEQ Figure \* ARABIC ">
-        <w:r>
-          <w:rPr>
-            <w:noProof/>
-          </w:rPr>
-          <w:t>16</w:t>
-        </w:r>
-      </w:fldSimple>
+      <w:r>
+        <w:fldChar w:fldCharType="begin"/>
+      </w:r>
+      <w:r>
+        <w:instrText xml:space="preserve"> SEQ Figure \* ARABIC </w:instrText>
+      </w:r>
+      <w:r>
+        <w:fldChar w:fldCharType="separate"/>
+      </w:r>
+      <w:r>
+        <w:rPr>
+          <w:noProof/>
+        </w:rPr>
+        <w:t>16</w:t>
+      </w:r>
+      <w:r>
+        <w:rPr>
+          <w:noProof/>
+        </w:rPr>
+        <w:fldChar w:fldCharType="end"/>
+      </w:r>
       <w:bookmarkEnd w:id="31"/>
       <w:r>
         <w:t>: Calculating the Early voltage requires working with the red and blue similar triangles.</w:t>
@@ -10674,7 +11263,13 @@
         <w:t>o</w:t>
       </w:r>
       <w:r>
-        <w:t>.  This gives us the final equation for the Early voltage in terms of the data gather from the oscilloscope using the cursor function.</w:t>
+        <w:t>.  This gives us the final equation for the Early voltage in terms of the data gather</w:t>
+      </w:r>
+      <w:r>
+        <w:t>ed</w:t>
+      </w:r>
+      <w:r>
+        <w:t xml:space="preserve"> from the oscilloscope using the cursor function.</w:t>
       </w:r>
     </w:p>
     <w:p>
@@ -10853,14 +11448,27 @@
       <w:r>
         <w:t xml:space="preserve">Figure </w:t>
       </w:r>
-      <w:fldSimple w:instr=" SEQ Figure \* ARABIC ">
-        <w:r>
-          <w:rPr>
-            <w:noProof/>
-          </w:rPr>
-          <w:t>17</w:t>
-        </w:r>
-      </w:fldSimple>
+      <w:r>
+        <w:fldChar w:fldCharType="begin"/>
+      </w:r>
+      <w:r>
+        <w:instrText xml:space="preserve"> SEQ Figure \* ARABIC </w:instrText>
+      </w:r>
+      <w:r>
+        <w:fldChar w:fldCharType="separate"/>
+      </w:r>
+      <w:r>
+        <w:rPr>
+          <w:noProof/>
+        </w:rPr>
+        <w:t>17</w:t>
+      </w:r>
+      <w:r>
+        <w:rPr>
+          <w:noProof/>
+        </w:rPr>
+        <w:fldChar w:fldCharType="end"/>
+      </w:r>
       <w:bookmarkEnd w:id="32"/>
       <w:r>
         <w:t>: Measuring the Early voltage of the 6</w:t>
@@ -10877,10 +11485,16 @@
     </w:p>
     <w:p>
       <w:r>
-        <w:t xml:space="preserve">The right side of the screen provides all the information that you will need to fill in the information in Table 4.  To take the remaining measurements, leave the X1 and X2 cursors, and adjust the Y1 and Y2 cursors to measure the slope of the remaining curves.  As before, you may want to use change the vertical offset to move </w:t>
-      </w:r>
-      <w:r>
-        <w:t>the curves and make to see them</w:t>
+        <w:t xml:space="preserve">The right side of the screen provides all the information that you will need to fill in the information in Table 4.  To take the remaining measurements, leave the X1 and X2 cursors, and adjust the Y1 and Y2 cursors to measure the slope of the remaining curves.  </w:t>
+      </w:r>
+      <w:r>
+        <w:t>Y</w:t>
+      </w:r>
+      <w:r>
+        <w:t xml:space="preserve">ou may want to change the vertical offset to </w:t>
+      </w:r>
+      <w:r>
+        <w:t>better see the curves.</w:t>
       </w:r>
     </w:p>
     <w:p>
@@ -10933,7 +11547,19 @@
         <w:t>sloping</w:t>
       </w:r>
       <w:r>
-        <w:t xml:space="preserve"> upwards.  Use the cursor function and align the X1 and Y1 cursors at the left end of the active region, where the curve is flat.  Next align the X2 and Y2 cursors on the right end of the active region.  You can use the X1 and X2 flags at the bottom of the screen and the Y1, Y2 flags on the right side of the screen to interpret the values shown on the right</w:t>
+        <w:t xml:space="preserve"> upwards.  Use the cursor function and align the X1 and Y1 cursors at the left end of the active region, where the curve is flat.  Next align the X2 and Y2 cursors on the right end of the active region.  You can use the X1 and X2 </w:t>
+      </w:r>
+      <w:r>
+        <w:t>markers</w:t>
+      </w:r>
+      <w:r>
+        <w:t xml:space="preserve"> at the bottom of the screen and the Y1, Y2 </w:t>
+      </w:r>
+      <w:r>
+        <w:t>markers</w:t>
+      </w:r>
+      <w:r>
+        <w:t xml:space="preserve"> on the right side of the screen to interpret the values shown on the right</w:t>
       </w:r>
       <w:r>
         <w:t>-s</w:t>
@@ -10960,14 +11586,27 @@
       <w:r>
         <w:t xml:space="preserve">Table </w:t>
       </w:r>
-      <w:fldSimple w:instr=" SEQ Table \* ARABIC ">
-        <w:r>
-          <w:rPr>
-            <w:noProof/>
-          </w:rPr>
-          <w:t>5</w:t>
-        </w:r>
-      </w:fldSimple>
+      <w:r>
+        <w:fldChar w:fldCharType="begin"/>
+      </w:r>
+      <w:r>
+        <w:instrText xml:space="preserve"> SEQ Table \* ARABIC </w:instrText>
+      </w:r>
+      <w:r>
+        <w:fldChar w:fldCharType="separate"/>
+      </w:r>
+      <w:r>
+        <w:rPr>
+          <w:noProof/>
+        </w:rPr>
+        <w:t>5</w:t>
+      </w:r>
+      <w:r>
+        <w:rPr>
+          <w:noProof/>
+        </w:rPr>
+        <w:fldChar w:fldCharType="end"/>
+      </w:r>
       <w:bookmarkEnd w:id="33"/>
       <w:r>
         <w:t>: The Ealy Voltage table partially filled in using the data from</w:t>
@@ -11489,7 +12128,15 @@
         <w:ind w:left="0" w:firstLine="0"/>
       </w:pPr>
       <w:r>
-        <w:t>Hint, use Ctrl+click to follow links.  This also works for all the Figures and Tables in these labs.</w:t>
+        <w:t xml:space="preserve">Hint, use </w:t>
+      </w:r>
+      <w:proofErr w:type="spellStart"/>
+      <w:r>
+        <w:t>Ctrl+click</w:t>
+      </w:r>
+      <w:proofErr w:type="spellEnd"/>
+      <w:r>
+        <w:t xml:space="preserve"> to follow links.  This also works for all the Figures and Tables in these labs.</w:t>
       </w:r>
     </w:p>
     <w:p>

</xml_diff>